<commit_message>
updated so ZZZA; response doesn't report "resettable" long after reset pressed.
</commit_message>
<xml_diff>
--- a/documentation/ganymede design notes.docx
+++ b/documentation/ganymede design notes.docx
@@ -347,7 +347,7 @@
           <v:shape id="_x0000_i1025" type="#_x0000_t75" style="width:361.75pt;height:218.3pt" o:ole="">
             <v:imagedata r:id="rId5" o:title=""/>
           </v:shape>
-          <o:OLEObject Type="Embed" ProgID="Visio.Drawing.11" ShapeID="_x0000_i1025" DrawAspect="Content" ObjectID="_1830351775" r:id="rId6"/>
+          <o:OLEObject Type="Embed" ProgID="Visio.Drawing.11" ShapeID="_x0000_i1025" DrawAspect="Content" ObjectID="_1831139145" r:id="rId6"/>
         </w:object>
       </w:r>
     </w:p>
@@ -423,15 +423,7 @@
     </w:p>
     <w:p>
       <w:r>
-        <w:t xml:space="preserve">Possibly a RESET button should be provided before operation will resume from over voltage or overcurrent, because it’s likely there is a fault elsewhere and if </w:t>
-      </w:r>
-      <w:proofErr w:type="gramStart"/>
-      <w:r>
-        <w:t>uncorrected</w:t>
-      </w:r>
-      <w:proofErr w:type="gramEnd"/>
-      <w:r>
-        <w:t xml:space="preserve"> they will happen again immediately. </w:t>
+        <w:t xml:space="preserve">Possibly a RESET button should be provided before operation will resume from over voltage or overcurrent, because it’s likely there is a fault elsewhere and if uncorrected they will happen again immediately. </w:t>
       </w:r>
     </w:p>
     <w:p>
@@ -506,7 +498,7 @@
           <v:shape id="_x0000_i1026" type="#_x0000_t75" style="width:463.7pt;height:340.4pt" o:ole="">
             <v:imagedata r:id="rId7" o:title=""/>
           </v:shape>
-          <o:OLEObject Type="Embed" ProgID="Visio.Drawing.11" ShapeID="_x0000_i1026" DrawAspect="Content" ObjectID="_1830351776" r:id="rId8"/>
+          <o:OLEObject Type="Embed" ProgID="Visio.Drawing.11" ShapeID="_x0000_i1026" DrawAspect="Content" ObjectID="_1831139146" r:id="rId8"/>
         </w:object>
       </w:r>
     </w:p>
@@ -659,13 +651,8 @@
         </w:numPr>
       </w:pPr>
       <w:r>
-        <w:t xml:space="preserve">Touchscreen </w:t>
-      </w:r>
-      <w:proofErr w:type="gramStart"/>
-      <w:r>
-        <w:t>LCD;</w:t>
-      </w:r>
-      <w:proofErr w:type="gramEnd"/>
+        <w:t>Touchscreen LCD;</w:t>
+      </w:r>
     </w:p>
     <w:p>
       <w:pPr>
@@ -1124,7 +1111,7 @@
           <v:shape id="_x0000_i1027" type="#_x0000_t75" style="width:483.85pt;height:511.5pt" o:ole="">
             <v:imagedata r:id="rId9" o:title=""/>
           </v:shape>
-          <o:OLEObject Type="Embed" ProgID="Visio.Drawing.15" ShapeID="_x0000_i1027" DrawAspect="Content" ObjectID="_1830351777" r:id="rId10"/>
+          <o:OLEObject Type="Embed" ProgID="Visio.Drawing.15" ShapeID="_x0000_i1027" DrawAspect="Content" ObjectID="_1831139147" r:id="rId10"/>
         </w:object>
       </w:r>
     </w:p>
@@ -2484,15 +2471,7 @@
           <w:p/>
           <w:p>
             <w:r>
-              <w:t>“</w:t>
-            </w:r>
-            <w:proofErr w:type="gramStart"/>
-            <w:r>
-              <w:t>key</w:t>
-            </w:r>
-            <w:proofErr w:type="gramEnd"/>
-            <w:r>
-              <w:t xml:space="preserve"> down” counter at top right</w:t>
+              <w:t>“key down” counter at top right</w:t>
             </w:r>
           </w:p>
           <w:p/>
@@ -2792,15 +2771,7 @@
           <w:p/>
           <w:p>
             <w:r>
-              <w:t xml:space="preserve">“PIN” is a numerical entry; user to enter a </w:t>
-            </w:r>
-            <w:proofErr w:type="gramStart"/>
-            <w:r>
-              <w:t>4 digit</w:t>
-            </w:r>
-            <w:proofErr w:type="gramEnd"/>
-            <w:r>
-              <w:t xml:space="preserve"> number 1-9999</w:t>
+              <w:t>“PIN” is a numerical entry; user to enter a 4 digit number 1-9999</w:t>
             </w:r>
           </w:p>
           <w:p/>
@@ -2936,23 +2907,7 @@
     </w:p>
     <w:p>
       <w:r>
-        <w:t xml:space="preserve">There needs to be a way for the factory to disable protection: essentially allowing fault conditions. A suggested approach </w:t>
-      </w:r>
-      <w:proofErr w:type="gramStart"/>
-      <w:r>
-        <w:t>is:</w:t>
-      </w:r>
-      <w:proofErr w:type="gramEnd"/>
-      <w:r>
-        <w:t xml:space="preserve"> have a </w:t>
-      </w:r>
-      <w:proofErr w:type="gramStart"/>
-      <w:r>
-        <w:t>4 digit</w:t>
-      </w:r>
-      <w:proofErr w:type="gramEnd"/>
-      <w:r>
-        <w:t xml:space="preserve"> PIN which is entered, allows protection to be disabled. </w:t>
+        <w:t xml:space="preserve">There needs to be a way for the factory to disable protection: essentially allowing fault conditions. A suggested approach is: have a 4 digit PIN which is entered, allows protection to be disabled. </w:t>
       </w:r>
       <w:r>
         <w:t>After initial programming, the PIN will be set to 0000 which is interpreted as disabled. The PIN will be stored in EEPROM.</w:t>
@@ -2972,15 +2927,7 @@
         </w:numPr>
       </w:pPr>
       <w:r>
-        <w:t xml:space="preserve">After power on, the PIN is loaded from EEPROM. If </w:t>
-      </w:r>
-      <w:proofErr w:type="gramStart"/>
-      <w:r>
-        <w:t>non zero</w:t>
-      </w:r>
-      <w:proofErr w:type="gramEnd"/>
-      <w:r>
-        <w:t xml:space="preserve">, enable protection. </w:t>
+        <w:t xml:space="preserve">After power on, the PIN is loaded from EEPROM. If non zero, enable protection. </w:t>
       </w:r>
     </w:p>
     <w:p>
@@ -3040,15 +2987,7 @@
         </w:numPr>
       </w:pPr>
       <w:r>
-        <w:t xml:space="preserve">The user can enter a </w:t>
-      </w:r>
-      <w:proofErr w:type="gramStart"/>
-      <w:r>
-        <w:t>4 digit</w:t>
-      </w:r>
-      <w:proofErr w:type="gramEnd"/>
-      <w:r>
-        <w:t xml:space="preserve"> PIN</w:t>
+        <w:t>The user can enter a 4 digit PIN</w:t>
       </w:r>
     </w:p>
     <w:p>
@@ -3105,15 +3044,7 @@
         </w:numPr>
       </w:pPr>
       <w:r>
-        <w:t xml:space="preserve">If current stored PIN is </w:t>
-      </w:r>
-      <w:proofErr w:type="gramStart"/>
-      <w:r>
-        <w:t>non zero</w:t>
-      </w:r>
-      <w:proofErr w:type="gramEnd"/>
-      <w:r>
-        <w:t xml:space="preserve">: </w:t>
+        <w:t xml:space="preserve">If current stored PIN is non zero: </w:t>
       </w:r>
       <w:r>
         <w:t xml:space="preserve">compare entered PIN with the stored one. If equal, </w:t>

</xml_diff>